<commit_message>
Publish v2.0.0-rc1 manuals, examples and distribution records
</commit_message>
<xml_diff>
--- a/docs/CosmicScanner_v2.0.0_User_Manual_CN.docx
+++ b/docs/CosmicScanner_v2.0.0_User_Manual_CN.docx
@@ -13235,7 +13235,7 @@
               <w:rPr>
                 <w:sz w:val="18"/>
               </w:rPr>
-              <w:t>CosmicScanner-v2.0.0-validation-linux-x86_64.tar.gz</w:t>
+              <w:t>CosmicScanner-v2.0.0-rc1-linux-x86_64.tar.gz</w:t>
             </w:r>
           </w:p>
         </w:tc>
@@ -13300,7 +13300,7 @@
               <w:rPr>
                 <w:sz w:val="18"/>
               </w:rPr>
-              <w:t>CosmicScanner-v2.0.0-windows-x86_64.zip</w:t>
+              <w:t>CosmicScanner-v2.0.0-rc1-windows-x86_64.zip</w:t>
             </w:r>
           </w:p>
         </w:tc>
@@ -13371,7 +13371,7 @@
               <w:rPr>
                 <w:sz w:val="18"/>
               </w:rPr>
-              <w:t>CosmicScanner-v2.0.0-macos-arm64.tar.gz</w:t>
+              <w:t>CosmicScanner-v2.0.0-rc1-macos-arm64.tar.gz</w:t>
             </w:r>
           </w:p>
         </w:tc>
@@ -13440,7 +13440,7 @@
               <w:rPr>
                 <w:sz w:val="18"/>
               </w:rPr>
-              <w:t>CosmicScanner-v2.0.0-macos-x86_64.tar.gz</w:t>
+              <w:t>CosmicScanner-v2.0.0-rc1-macos-x86_64.tar.gz</w:t>
             </w:r>
           </w:p>
         </w:tc>
@@ -13544,7 +13544,7 @@
           <w:rFonts w:ascii="Consolas" w:hAnsi="Consolas"/>
           <w:sz w:val="17"/>
         </w:rPr>
-        <w:t>sha256sum -c CosmicScanner-v2.0.0-validation-linux-x86_64.tar.gz.sha256</w:t>
+        <w:t>sha256sum -c CosmicScanner-v2.0.0-rc1-linux-x86_64.tar.gz.sha256</w:t>
       </w:r>
     </w:p>
     <w:p>
@@ -13594,7 +13594,7 @@
           <w:rFonts w:ascii="Consolas" w:hAnsi="Consolas"/>
           <w:sz w:val="17"/>
         </w:rPr>
-        <w:t>shasum -a 256 -c CosmicScanner-v2.0.0-macos-arm64.tar.gz.sha256</w:t>
+        <w:t>shasum -a 256 -c CosmicScanner-v2.0.0-rc1-macos-arm64.tar.gz.sha256</w:t>
       </w:r>
     </w:p>
     <w:p>
@@ -13636,7 +13636,7 @@
           <w:rFonts w:ascii="Consolas" w:hAnsi="Consolas"/>
           <w:sz w:val="17"/>
         </w:rPr>
-        <w:t>Get-FileHash -Algorithm SHA256 -LiteralPath CosmicScanner-v2.0.0-windows-x86_64.zip</w:t>
+        <w:t>Get-FileHash -Algorithm SHA256 -LiteralPath CosmicScanner-v2.0.0-rc1-windows-x86_64.zip</w:t>
       </w:r>
     </w:p>
     <w:p>
@@ -13648,7 +13648,7 @@
           <w:rFonts w:ascii="Consolas" w:hAnsi="Consolas"/>
           <w:sz w:val="17"/>
         </w:rPr>
-        <w:t>Get-Content -LiteralPath CosmicScanner-v2.0.0-windows-x86_64.zip.sha256</w:t>
+        <w:t>Get-Content -LiteralPath CosmicScanner-v2.0.0-rc1-windows-x86_64.zip.sha256</w:t>
       </w:r>
     </w:p>
     <w:p>
@@ -13690,7 +13690,7 @@
           <w:rFonts w:ascii="Consolas" w:hAnsi="Consolas"/>
           <w:sz w:val="17"/>
         </w:rPr>
-        <w:t>tar -xzf CosmicScanner-v2.0.0-validation-linux-x86_64.tar.gz</w:t>
+        <w:t>tar -xzf CosmicScanner-v2.0.0-rc1-linux-x86_64.tar.gz</w:t>
       </w:r>
     </w:p>
     <w:p>
@@ -13703,7 +13703,7 @@
           <w:rFonts w:ascii="Consolas" w:hAnsi="Consolas"/>
           <w:sz w:val="17"/>
         </w:rPr>
-        <w:t>cd CosmicScanner-v2.0.0-validation-linux-x86_64</w:t>
+        <w:t>cd CosmicScanner-v2.0.0-rc1-linux-x86_64</w:t>
       </w:r>
     </w:p>
     <w:p>
@@ -13812,7 +13812,7 @@
           <w:rFonts w:ascii="Consolas" w:hAnsi="Consolas"/>
           <w:sz w:val="17"/>
         </w:rPr>
-        <w:t>Expand-Archive -LiteralPath CosmicScanner-v2.0.0-windows-x86_64.zip -DestinationPath .</w:t>
+        <w:t>Expand-Archive -LiteralPath CosmicScanner-v2.0.0-rc1-windows-x86_64.zip -DestinationPath .</w:t>
       </w:r>
     </w:p>
     <w:p>
@@ -13825,7 +13825,7 @@
           <w:rFonts w:ascii="Consolas" w:hAnsi="Consolas"/>
           <w:sz w:val="17"/>
         </w:rPr>
-        <w:t>Set-Location .\CosmicScanner-v2.0.0-windows-x86_64</w:t>
+        <w:t>Set-Location .\CosmicScanner-v2.0.0-rc1-windows-x86_64</w:t>
       </w:r>
     </w:p>
     <w:p>
@@ -13980,7 +13980,7 @@
           <w:rFonts w:ascii="Consolas" w:hAnsi="Consolas"/>
           <w:sz w:val="17"/>
         </w:rPr>
-        <w:t>tar -xzf CosmicScanner-v2.0.0-macos-arm64.tar.gz</w:t>
+        <w:t>tar -xzf CosmicScanner-v2.0.0-rc1-macos-arm64.tar.gz</w:t>
       </w:r>
     </w:p>
     <w:p>
@@ -13993,7 +13993,7 @@
           <w:rFonts w:ascii="Consolas" w:hAnsi="Consolas"/>
           <w:sz w:val="17"/>
         </w:rPr>
-        <w:t>cd CosmicScanner-v2.0.0-macos-arm64</w:t>
+        <w:t>cd CosmicScanner-v2.0.0-rc1-macos-arm64</w:t>
       </w:r>
     </w:p>
     <w:p>
@@ -16435,7 +16435,7 @@
           <w:rFonts w:ascii="Consolas" w:hAnsi="Consolas"/>
           <w:sz w:val="17"/>
         </w:rPr>
-        <w:t>"$BIN" --bfile "$DATA/synth" --pheno "$DATA/quantitative.pheno" \</w:t>
+        <w:t>"$BIN" gwas --model lmm --bfile "$DATA/synth" \</w:t>
       </w:r>
     </w:p>
     <w:p>
@@ -16448,7 +16448,7 @@
           <w:rFonts w:ascii="Consolas" w:hAnsi="Consolas"/>
           <w:sz w:val="17"/>
         </w:rPr>
-        <w:t xml:space="preserve">  --mpheno 1 --gwas --model lmm --threads 1 --out demo_results/lmm</w:t>
+        <w:t xml:space="preserve">  --pheno "$DATA/quantitative.pheno" --mpheno 1 --threads 1 --out demo_results/lmm</w:t>
       </w:r>
     </w:p>
     <w:p>

</xml_diff>